<commit_message>
V3.0.10 - enhanced tabletop genenation quality
</commit_message>
<xml_diff>
--- a/planet_it_tabletop_report_template.docx
+++ b/planet_it_tabletop_report_template.docx
@@ -8690,14 +8690,161 @@
           <w:p>
             <w:pPr>
               <w:cnfStyle w:val="000000100000" w:firstRow="0" w:lastRow="0" w:firstColumn="0" w:lastColumn="0" w:oddVBand="0" w:evenVBand="0" w:oddHBand="1" w:evenHBand="0" w:firstRowFirstColumn="0" w:firstRowLastColumn="0" w:lastRowFirstColumn="0" w:lastRowLastColumn="0"/>
+              <w:rPr>
+                <w:szCs w:val="20"/>
+                <w:lang w:eastAsia="en-GB"/>
+              </w:rPr>
             </w:pPr>
+            <w:r>
+              <w:lastRenderedPageBreak/>
+              <w:t xml:space="preserve">{% for action in </w:t>
+            </w:r>
+            <w:proofErr w:type="spellStart"/>
+            <w:r>
+              <w:t>improvement_actions</w:t>
+            </w:r>
+            <w:proofErr w:type="spellEnd"/>
+            <w:r>
+              <w:t xml:space="preserve"> </w:t>
+            </w:r>
+            <w:proofErr w:type="gramStart"/>
+            <w:r>
+              <w:t>%}</w:t>
+            </w:r>
             <w:r>
               <w:rPr>
                 <w:b/>
                 <w:bCs/>
               </w:rPr>
+              <w:t>Accountable</w:t>
+            </w:r>
+            <w:proofErr w:type="gramEnd"/>
+            <w:r>
+              <w:rPr>
+                <w:b/>
+                <w:bCs/>
+              </w:rPr>
+              <w:t>:</w:t>
+            </w:r>
+            <w:r>
+              <w:t xml:space="preserve"> </w:t>
+            </w:r>
+            <w:proofErr w:type="gramStart"/>
+            <w:r>
+              <w:t xml:space="preserve">{{ </w:t>
+            </w:r>
+            <w:proofErr w:type="spellStart"/>
+            <w:r>
+              <w:t>action</w:t>
+            </w:r>
+            <w:proofErr w:type="gramEnd"/>
+            <w:r>
+              <w:t>.accountable_owner</w:t>
+            </w:r>
+            <w:proofErr w:type="spellEnd"/>
+            <w:r>
+              <w:t xml:space="preserve"> }}</w:t>
+            </w:r>
+            <w:r>
+              <w:br/>
+            </w:r>
+            <w:r>
+              <w:rPr>
+                <w:b/>
+                <w:bCs/>
+              </w:rPr>
+              <w:t>Supporting:</w:t>
+            </w:r>
+            <w:r>
+              <w:t xml:space="preserve"> </w:t>
+            </w:r>
+            <w:proofErr w:type="gramStart"/>
+            <w:r>
+              <w:t xml:space="preserve">{{ </w:t>
+            </w:r>
+            <w:proofErr w:type="spellStart"/>
+            <w:r>
+              <w:t>action</w:t>
+            </w:r>
+            <w:proofErr w:type="gramEnd"/>
+            <w:r>
+              <w:t>.supporting_owners_display</w:t>
+            </w:r>
+            <w:proofErr w:type="spellEnd"/>
+            <w:r>
+              <w:t xml:space="preserve"> }}</w:t>
+            </w:r>
+            <w:r>
+              <w:br/>
+            </w:r>
+            <w:r>
+              <w:rPr>
+                <w:b/>
+                <w:bCs/>
+              </w:rPr>
+              <w:t>Target:</w:t>
+            </w:r>
+            <w:r>
+              <w:t xml:space="preserve"> </w:t>
+            </w:r>
+            <w:proofErr w:type="gramStart"/>
+            <w:r>
+              <w:t xml:space="preserve">{{ </w:t>
+            </w:r>
+            <w:proofErr w:type="spellStart"/>
+            <w:r>
+              <w:t>action</w:t>
+            </w:r>
+            <w:proofErr w:type="gramEnd"/>
+            <w:r>
+              <w:t>.target_display</w:t>
+            </w:r>
+            <w:proofErr w:type="spellEnd"/>
+            <w:r>
+              <w:t xml:space="preserve"> }}</w:t>
+            </w:r>
+            <w:r>
+              <w:br/>
+            </w:r>
+            <w:r>
+              <w:rPr>
+                <w:b/>
+                <w:bCs/>
+              </w:rPr>
+              <w:t>Review:</w:t>
+            </w:r>
+            <w:r>
+              <w:t xml:space="preserve"> </w:t>
+            </w:r>
+            <w:proofErr w:type="gramStart"/>
+            <w:r>
+              <w:t xml:space="preserve">{{ </w:t>
+            </w:r>
+            <w:proofErr w:type="spellStart"/>
+            <w:r>
+              <w:t>action</w:t>
+            </w:r>
+            <w:proofErr w:type="gramEnd"/>
+            <w:r>
+              <w:t>.review_date_di</w:t>
+            </w:r>
+            <w:r>
               <w:lastRenderedPageBreak/>
-              <w:t>Accountable:</w:t>
+              <w:t>splay</w:t>
+            </w:r>
+            <w:proofErr w:type="spellEnd"/>
+            <w:r>
+              <w:t xml:space="preserve"> }}</w:t>
+            </w:r>
+            <w:r>
+              <w:br/>
+            </w:r>
+            <w:r>
+              <w:rPr>
+                <w:b/>
+                <w:bCs/>
+              </w:rPr>
+              <w:t>Dependencies:</w:t>
             </w:r>
             <w:r>
               <w:t xml:space="preserve"> </w:t>
@@ -8712,19 +8859,52 @@
             </w:r>
             <w:proofErr w:type="gramEnd"/>
             <w:r>
-              <w:t>.accountable_</w:t>
-            </w:r>
-            <w:proofErr w:type="gramStart"/>
-            <w:r>
-              <w:t>owner</w:t>
-            </w:r>
-            <w:proofErr w:type="spellEnd"/>
-            <w:r>
-              <w:t xml:space="preserve"> }</w:t>
-            </w:r>
-            <w:proofErr w:type="gramEnd"/>
-            <w:r>
-              <w:t>}</w:t>
+              <w:t>.dependencies_</w:t>
+            </w:r>
+            <w:proofErr w:type="gramStart"/>
+            <w:r>
+              <w:t>display</w:t>
+            </w:r>
+            <w:proofErr w:type="spellEnd"/>
+            <w:r>
+              <w:t xml:space="preserve"> }}{</w:t>
+            </w:r>
+            <w:proofErr w:type="gramEnd"/>
+            <w:r>
+              <w:t xml:space="preserve">% if not </w:t>
+            </w:r>
+            <w:proofErr w:type="spellStart"/>
+            <w:proofErr w:type="gramStart"/>
+            <w:r>
+              <w:t>loop.last</w:t>
+            </w:r>
+            <w:proofErr w:type="spellEnd"/>
+            <w:proofErr w:type="gramEnd"/>
+            <w:r>
+              <w:t xml:space="preserve"> %}</w:t>
+            </w:r>
+            <w:r>
+              <w:br/>
+            </w:r>
+            <w:r>
+              <w:br/>
+              <w:t xml:space="preserve">{% endif </w:t>
+            </w:r>
+            <w:proofErr w:type="gramStart"/>
+            <w:r>
+              <w:t>%}{</w:t>
+            </w:r>
+            <w:proofErr w:type="gramEnd"/>
+            <w:r>
+              <w:t xml:space="preserve">% </w:t>
+            </w:r>
+            <w:proofErr w:type="spellStart"/>
+            <w:r>
+              <w:t>endfor</w:t>
+            </w:r>
+            <w:proofErr w:type="spellEnd"/>
+            <w:r>
+              <w:t xml:space="preserve"> %}</w:t>
             </w:r>
           </w:p>
           <w:p>
@@ -8869,7 +9049,6 @@
                 <w:b/>
                 <w:bCs/>
               </w:rPr>
-              <w:lastRenderedPageBreak/>
               <w:t>Dependencies:</w:t>
             </w:r>
             <w:r>
@@ -9638,6 +9817,9 @@
             </w:r>
             <w:r>
               <w:br/>
+            </w:r>
+            <w:r>
+              <w:lastRenderedPageBreak/>
               <w:t xml:space="preserve">{% endif </w:t>
             </w:r>
             <w:proofErr w:type="gramStart"/>
@@ -9668,6 +9850,7 @@
               <w:cnfStyle w:val="000000100000" w:firstRow="0" w:lastRow="0" w:firstColumn="0" w:lastColumn="0" w:oddVBand="0" w:evenVBand="0" w:oddHBand="1" w:evenHBand="0" w:firstRowFirstColumn="0" w:firstRowLastColumn="0" w:lastRowFirstColumn="0" w:lastRowLastColumn="0"/>
             </w:pPr>
             <w:r>
+              <w:lastRenderedPageBreak/>
               <w:t xml:space="preserve">{% for item in </w:t>
             </w:r>
             <w:proofErr w:type="spellStart"/>
@@ -9717,6 +9900,9 @@
             </w:r>
             <w:r>
               <w:br/>
+            </w:r>
+            <w:r>
+              <w:lastRenderedPageBreak/>
               <w:t xml:space="preserve">{% endif </w:t>
             </w:r>
             <w:proofErr w:type="gramStart"/>
@@ -9747,6 +9933,7 @@
               <w:cnfStyle w:val="000000100000" w:firstRow="0" w:lastRow="0" w:firstColumn="0" w:lastColumn="0" w:oddVBand="0" w:evenVBand="0" w:oddHBand="1" w:evenHBand="0" w:firstRowFirstColumn="0" w:firstRowLastColumn="0" w:lastRowFirstColumn="0" w:lastRowLastColumn="0"/>
             </w:pPr>
             <w:r>
+              <w:lastRenderedPageBreak/>
               <w:t xml:space="preserve">{% for item in </w:t>
             </w:r>
             <w:proofErr w:type="spellStart"/>
@@ -9796,6 +9983,9 @@
             </w:r>
             <w:r>
               <w:br/>
+            </w:r>
+            <w:r>
+              <w:lastRenderedPageBreak/>
               <w:t xml:space="preserve">{% endif </w:t>
             </w:r>
             <w:proofErr w:type="gramStart"/>
@@ -9830,6 +10020,7 @@
               </w:rPr>
             </w:pPr>
             <w:r>
+              <w:lastRenderedPageBreak/>
               <w:t xml:space="preserve">{% for item in </w:t>
             </w:r>
             <w:proofErr w:type="spellStart"/>
@@ -10030,7 +10221,6 @@
           <w:b/>
           <w:bCs/>
         </w:rPr>
-        <w:lastRenderedPageBreak/>
         <w:t>Suggested improvement:</w:t>
       </w:r>
       <w:r>

</xml_diff>